<commit_message>
refactor(get_overwatch): limiter aux 10 colonnes utiles (hero_key,name,age,location,role,subrole,total_hp,health,shields,armor) + code simplifié et commenté; docs alignées
</commit_message>
<xml_diff>
--- a/TP autonomie API OverFast.docx
+++ b/TP autonomie API OverFast.docx
@@ -103,29 +103,8 @@
       </w:r>
       <w:proofErr w:type="spellEnd"/>
       <w:r>
-        <w:t xml:space="preserve"> = {'class</w:t>
-      </w:r>
-      <w:proofErr w:type="gramStart"/>
-      <w:r>
-        <w:t>':</w:t>
-      </w:r>
-      <w:proofErr w:type="gramEnd"/>
-      <w:r>
-        <w:t>'SimpleStrategy','replication_factor</w:t>
-      </w:r>
-      <w:proofErr w:type="gramStart"/>
-      <w:r>
-        <w:t>':</w:t>
-      </w:r>
-      <w:proofErr w:type="gramEnd"/>
-      <w:r>
-        <w:t>1</w:t>
-      </w:r>
-      <w:proofErr w:type="gramStart"/>
-      <w:r>
-        <w:t>};</w:t>
-      </w:r>
-      <w:proofErr w:type="gramEnd"/>
+        <w:t xml:space="preserve"> = {'class':'SimpleStrategy','replication_factor':1};</w:t>
+      </w:r>
     </w:p>
     <w:p/>
     <w:p>
@@ -138,12 +117,10 @@
         <w:t xml:space="preserve">"CREATE TABLE IF NOT EXISTS </w:t>
       </w:r>
       <w:proofErr w:type="spellStart"/>
-      <w:proofErr w:type="gramStart"/>
       <w:r>
         <w:t>overwatch.heroes</w:t>
       </w:r>
       <w:proofErr w:type="spellEnd"/>
-      <w:proofErr w:type="gramEnd"/>
       <w:r>
         <w:t xml:space="preserve"> (</w:t>
       </w:r>
@@ -417,38 +394,22 @@
       </w:r>
       <w:proofErr w:type="spellEnd"/>
       <w:r>
-        <w:t xml:space="preserve"> timestamp</w:t>
-      </w:r>
-      <w:proofErr w:type="gramStart"/>
-      <w:r>
-        <w:t>);</w:t>
-      </w:r>
-      <w:proofErr w:type="gramEnd"/>
-      <w:r>
-        <w:t>"</w:t>
+        <w:t xml:space="preserve"> timestamp);"</w:t>
       </w:r>
     </w:p>
     <w:p/>
     <w:p>
       <w:proofErr w:type="spellStart"/>
-      <w:proofErr w:type="gramStart"/>
       <w:r>
         <w:t>cqlsh</w:t>
       </w:r>
       <w:proofErr w:type="spellEnd"/>
-      <w:proofErr w:type="gramEnd"/>
-      <w:r>
-        <w:t xml:space="preserve">&gt; DESCRIBE </w:t>
-      </w:r>
-      <w:proofErr w:type="gramStart"/>
-      <w:r>
-        <w:t>KEYSPACES;</w:t>
-      </w:r>
-      <w:proofErr w:type="gramEnd"/>
-    </w:p>
-    <w:p>
-      <w:proofErr w:type="spellStart"/>
-      <w:proofErr w:type="gramStart"/>
+      <w:r>
+        <w:t>&gt; DESCRIBE KEYSPACES;</w:t>
+      </w:r>
+    </w:p>
+    <w:p>
+      <w:proofErr w:type="spellStart"/>
       <w:r>
         <w:t>overwatch</w:t>
       </w:r>
@@ -458,11 +419,7 @@
       </w:r>
       <w:proofErr w:type="spellStart"/>
       <w:r>
-        <w:t>system</w:t>
-      </w:r>
-      <w:proofErr w:type="gramEnd"/>
-      <w:r>
-        <w:t>_auth</w:t>
+        <w:t>system_auth</w:t>
       </w:r>
       <w:proofErr w:type="spellEnd"/>
       <w:r>
@@ -470,11 +427,7 @@
       </w:r>
       <w:proofErr w:type="spellStart"/>
       <w:r>
-        <w:t>system_</w:t>
-      </w:r>
-      <w:proofErr w:type="gramStart"/>
-      <w:r>
-        <w:t>schema</w:t>
+        <w:t>system_schema</w:t>
       </w:r>
       <w:proofErr w:type="spellEnd"/>
       <w:r>
@@ -482,30 +435,17 @@
       </w:r>
       <w:proofErr w:type="spellStart"/>
       <w:r>
-        <w:t>system</w:t>
-      </w:r>
-      <w:proofErr w:type="gramEnd"/>
-      <w:r>
-        <w:t>_views</w:t>
-      </w:r>
-      <w:proofErr w:type="spellEnd"/>
-    </w:p>
-    <w:p>
-      <w:proofErr w:type="gramStart"/>
-      <w:r>
-        <w:t>system</w:t>
-      </w:r>
-      <w:proofErr w:type="gramEnd"/>
-      <w:r>
-        <w:t xml:space="preserve">     </w:t>
-      </w:r>
-      <w:proofErr w:type="spellStart"/>
-      <w:r>
-        <w:t>system_</w:t>
-      </w:r>
-      <w:proofErr w:type="gramStart"/>
-      <w:r>
-        <w:t>distributed</w:t>
+        <w:t>system_views</w:t>
+      </w:r>
+      <w:proofErr w:type="spellEnd"/>
+    </w:p>
+    <w:p>
+      <w:r>
+        <w:t xml:space="preserve">system     </w:t>
+      </w:r>
+      <w:proofErr w:type="spellStart"/>
+      <w:r>
+        <w:t>system_distributed</w:t>
       </w:r>
       <w:proofErr w:type="spellEnd"/>
       <w:r>
@@ -513,15 +453,7 @@
       </w:r>
       <w:proofErr w:type="spellStart"/>
       <w:r>
-        <w:t>system</w:t>
-      </w:r>
-      <w:proofErr w:type="gramEnd"/>
-      <w:r>
-        <w:t>_</w:t>
-      </w:r>
-      <w:proofErr w:type="gramStart"/>
-      <w:r>
-        <w:t>traces</w:t>
+        <w:t>system_traces</w:t>
       </w:r>
       <w:proofErr w:type="spellEnd"/>
       <w:r>
@@ -529,40 +461,27 @@
       </w:r>
       <w:proofErr w:type="spellStart"/>
       <w:r>
-        <w:t>system</w:t>
-      </w:r>
-      <w:proofErr w:type="gramEnd"/>
-      <w:r>
-        <w:t>_virtual_schema</w:t>
+        <w:t>system_virtual_schema</w:t>
       </w:r>
       <w:proofErr w:type="spellEnd"/>
     </w:p>
     <w:p/>
     <w:p>
       <w:proofErr w:type="spellStart"/>
-      <w:proofErr w:type="gramStart"/>
       <w:r>
         <w:t>cqlsh:overwatch</w:t>
       </w:r>
       <w:proofErr w:type="spellEnd"/>
-      <w:proofErr w:type="gramEnd"/>
-      <w:r>
-        <w:t xml:space="preserve">&gt; DESCRIBE </w:t>
-      </w:r>
-      <w:proofErr w:type="gramStart"/>
-      <w:r>
-        <w:t>TABLES;</w:t>
-      </w:r>
-      <w:proofErr w:type="gramEnd"/>
-    </w:p>
-    <w:p>
-      <w:proofErr w:type="spellStart"/>
-      <w:proofErr w:type="gramStart"/>
+      <w:r>
+        <w:t>&gt; DESCRIBE TABLES;</w:t>
+      </w:r>
+    </w:p>
+    <w:p>
+      <w:proofErr w:type="spellStart"/>
       <w:r>
         <w:t>heroes</w:t>
       </w:r>
       <w:proofErr w:type="spellEnd"/>
-      <w:proofErr w:type="gramEnd"/>
     </w:p>
     <w:p/>
     <w:p>
@@ -570,17 +489,14 @@
         <w:spacing w:line="240" w:lineRule="auto"/>
       </w:pPr>
       <w:proofErr w:type="spellStart"/>
-      <w:proofErr w:type="gramStart"/>
       <w:r>
         <w:t>cqlsh:overwatch</w:t>
       </w:r>
       <w:proofErr w:type="spellEnd"/>
-      <w:proofErr w:type="gramEnd"/>
       <w:r>
         <w:t xml:space="preserve">&gt; DESCRIBE TABLE </w:t>
       </w:r>
       <w:proofErr w:type="spellStart"/>
-      <w:proofErr w:type="gramStart"/>
       <w:r>
         <w:t>heroes</w:t>
       </w:r>
@@ -588,7 +504,6 @@
       <w:r>
         <w:t>;</w:t>
       </w:r>
-      <w:proofErr w:type="gramEnd"/>
     </w:p>
     <w:p>
       <w:pPr>
@@ -598,12 +513,10 @@
         <w:t xml:space="preserve">CREATE TABLE </w:t>
       </w:r>
       <w:proofErr w:type="spellStart"/>
-      <w:proofErr w:type="gramStart"/>
       <w:r>
         <w:t>overwatch.heroes</w:t>
       </w:r>
       <w:proofErr w:type="spellEnd"/>
-      <w:proofErr w:type="gramEnd"/>
       <w:r>
         <w:t xml:space="preserve"> (</w:t>
       </w:r>
@@ -616,13 +529,8 @@
         <w:t xml:space="preserve">    </w:t>
       </w:r>
       <w:proofErr w:type="spellStart"/>
-      <w:proofErr w:type="gramStart"/>
-      <w:r>
-        <w:t>hero</w:t>
-      </w:r>
-      <w:proofErr w:type="gramEnd"/>
-      <w:r>
-        <w:t>_key</w:t>
+      <w:r>
+        <w:t>hero_key</w:t>
       </w:r>
       <w:proofErr w:type="spellEnd"/>
       <w:r>
@@ -645,12 +553,10 @@
         <w:t xml:space="preserve">    </w:t>
       </w:r>
       <w:proofErr w:type="spellStart"/>
-      <w:proofErr w:type="gramStart"/>
       <w:r>
         <w:t>age</w:t>
       </w:r>
       <w:proofErr w:type="spellEnd"/>
-      <w:proofErr w:type="gramEnd"/>
       <w:r>
         <w:t xml:space="preserve"> </w:t>
       </w:r>
@@ -671,12 +577,10 @@
         <w:t xml:space="preserve">    </w:t>
       </w:r>
       <w:proofErr w:type="spellStart"/>
-      <w:proofErr w:type="gramStart"/>
       <w:r>
         <w:t>armor</w:t>
       </w:r>
       <w:proofErr w:type="spellEnd"/>
-      <w:proofErr w:type="gramEnd"/>
       <w:r>
         <w:t xml:space="preserve"> </w:t>
       </w:r>
@@ -697,12 +601,10 @@
         <w:t xml:space="preserve">    </w:t>
       </w:r>
       <w:proofErr w:type="spellStart"/>
-      <w:proofErr w:type="gramStart"/>
       <w:r>
         <w:t>birthday</w:t>
       </w:r>
       <w:proofErr w:type="spellEnd"/>
-      <w:proofErr w:type="gramEnd"/>
       <w:r>
         <w:t xml:space="preserve"> </w:t>
       </w:r>
@@ -720,39 +622,29 @@
         <w:spacing w:line="240" w:lineRule="auto"/>
       </w:pPr>
       <w:r>
+        <w:t xml:space="preserve">    description </w:t>
+      </w:r>
+      <w:proofErr w:type="spellStart"/>
+      <w:r>
+        <w:t>text</w:t>
+      </w:r>
+      <w:proofErr w:type="spellEnd"/>
+      <w:r>
+        <w:t>,</w:t>
+      </w:r>
+    </w:p>
+    <w:p>
+      <w:pPr>
+        <w:spacing w:line="240" w:lineRule="auto"/>
+      </w:pPr>
+      <w:r>
         <w:t xml:space="preserve">    </w:t>
       </w:r>
-      <w:proofErr w:type="gramStart"/>
-      <w:r>
-        <w:t>description</w:t>
-      </w:r>
-      <w:proofErr w:type="gramEnd"/>
-      <w:r>
-        <w:t xml:space="preserve"> </w:t>
-      </w:r>
-      <w:proofErr w:type="spellStart"/>
-      <w:r>
-        <w:t>text</w:t>
-      </w:r>
-      <w:proofErr w:type="spellEnd"/>
-      <w:r>
-        <w:t>,</w:t>
-      </w:r>
-    </w:p>
-    <w:p>
-      <w:pPr>
-        <w:spacing w:line="240" w:lineRule="auto"/>
-      </w:pPr>
-      <w:r>
-        <w:t xml:space="preserve">    </w:t>
-      </w:r>
-      <w:proofErr w:type="spellStart"/>
-      <w:proofErr w:type="gramStart"/>
+      <w:proofErr w:type="spellStart"/>
       <w:r>
         <w:t>health</w:t>
       </w:r>
       <w:proofErr w:type="spellEnd"/>
-      <w:proofErr w:type="gramEnd"/>
       <w:r>
         <w:t xml:space="preserve"> </w:t>
       </w:r>
@@ -774,13 +666,8 @@
         <w:t xml:space="preserve">    </w:t>
       </w:r>
       <w:proofErr w:type="spellStart"/>
-      <w:proofErr w:type="gramStart"/>
-      <w:r>
-        <w:t>last</w:t>
-      </w:r>
-      <w:proofErr w:type="gramEnd"/>
-      <w:r>
-        <w:t>_update</w:t>
+      <w:r>
+        <w:t>last_update</w:t>
       </w:r>
       <w:proofErr w:type="spellEnd"/>
       <w:r>
@@ -792,13 +679,29 @@
         <w:spacing w:line="240" w:lineRule="auto"/>
       </w:pPr>
       <w:r>
+        <w:t xml:space="preserve">    location </w:t>
+      </w:r>
+      <w:proofErr w:type="spellStart"/>
+      <w:r>
+        <w:t>text</w:t>
+      </w:r>
+      <w:proofErr w:type="spellEnd"/>
+      <w:r>
+        <w:t>,</w:t>
+      </w:r>
+    </w:p>
+    <w:p>
+      <w:pPr>
+        <w:spacing w:line="240" w:lineRule="auto"/>
+      </w:pPr>
+      <w:r>
         <w:t xml:space="preserve">    </w:t>
       </w:r>
-      <w:proofErr w:type="gramStart"/>
-      <w:r>
-        <w:t>location</w:t>
-      </w:r>
-      <w:proofErr w:type="gramEnd"/>
+      <w:proofErr w:type="spellStart"/>
+      <w:r>
+        <w:t>name</w:t>
+      </w:r>
+      <w:proofErr w:type="spellEnd"/>
       <w:r>
         <w:t xml:space="preserve"> </w:t>
       </w:r>
@@ -819,12 +722,10 @@
         <w:t xml:space="preserve">    </w:t>
       </w:r>
       <w:proofErr w:type="spellStart"/>
-      <w:proofErr w:type="gramStart"/>
-      <w:r>
-        <w:t>name</w:t>
-      </w:r>
-      <w:proofErr w:type="spellEnd"/>
-      <w:proofErr w:type="gramEnd"/>
+      <w:r>
+        <w:t>perks_json</w:t>
+      </w:r>
+      <w:proofErr w:type="spellEnd"/>
       <w:r>
         <w:t xml:space="preserve"> </w:t>
       </w:r>
@@ -842,16 +743,27 @@
         <w:spacing w:line="240" w:lineRule="auto"/>
       </w:pPr>
       <w:r>
+        <w:t xml:space="preserve">    portrait </w:t>
+      </w:r>
+      <w:proofErr w:type="spellStart"/>
+      <w:r>
+        <w:t>text</w:t>
+      </w:r>
+      <w:proofErr w:type="spellEnd"/>
+      <w:r>
+        <w:t>,</w:t>
+      </w:r>
+    </w:p>
+    <w:p>
+      <w:pPr>
+        <w:spacing w:line="240" w:lineRule="auto"/>
+      </w:pPr>
+      <w:r>
         <w:t xml:space="preserve">    </w:t>
       </w:r>
       <w:proofErr w:type="spellStart"/>
-      <w:proofErr w:type="gramStart"/>
-      <w:r>
-        <w:t>perks</w:t>
-      </w:r>
-      <w:proofErr w:type="gramEnd"/>
-      <w:r>
-        <w:t>_json</w:t>
+      <w:r>
+        <w:t>raw_json</w:t>
       </w:r>
       <w:proofErr w:type="spellEnd"/>
       <w:r>
@@ -873,11 +785,11 @@
       <w:r>
         <w:t xml:space="preserve">    </w:t>
       </w:r>
-      <w:proofErr w:type="gramStart"/>
-      <w:r>
-        <w:t>portrait</w:t>
-      </w:r>
-      <w:proofErr w:type="gramEnd"/>
+      <w:proofErr w:type="spellStart"/>
+      <w:r>
+        <w:t>role</w:t>
+      </w:r>
+      <w:proofErr w:type="spellEnd"/>
       <w:r>
         <w:t xml:space="preserve"> </w:t>
       </w:r>
@@ -898,17 +810,28 @@
         <w:t xml:space="preserve">    </w:t>
       </w:r>
       <w:proofErr w:type="spellStart"/>
-      <w:proofErr w:type="gramStart"/>
-      <w:r>
-        <w:t>raw</w:t>
-      </w:r>
-      <w:proofErr w:type="gramEnd"/>
-      <w:r>
-        <w:t>_json</w:t>
-      </w:r>
-      <w:proofErr w:type="spellEnd"/>
-      <w:r>
-        <w:t xml:space="preserve"> </w:t>
+      <w:r>
+        <w:t>shields</w:t>
+      </w:r>
+      <w:proofErr w:type="spellEnd"/>
+      <w:r>
+        <w:t xml:space="preserve"> </w:t>
+      </w:r>
+      <w:proofErr w:type="spellStart"/>
+      <w:r>
+        <w:t>int</w:t>
+      </w:r>
+      <w:proofErr w:type="spellEnd"/>
+      <w:r>
+        <w:t>,</w:t>
+      </w:r>
+    </w:p>
+    <w:p>
+      <w:pPr>
+        <w:spacing w:line="240" w:lineRule="auto"/>
+      </w:pPr>
+      <w:r>
+        <w:t xml:space="preserve">    story </w:t>
       </w:r>
       <w:proofErr w:type="spellStart"/>
       <w:r>
@@ -927,12 +850,10 @@
         <w:t xml:space="preserve">    </w:t>
       </w:r>
       <w:proofErr w:type="spellStart"/>
-      <w:proofErr w:type="gramStart"/>
-      <w:r>
-        <w:t>role</w:t>
-      </w:r>
-      <w:proofErr w:type="spellEnd"/>
-      <w:proofErr w:type="gramEnd"/>
+      <w:r>
+        <w:t>subrole</w:t>
+      </w:r>
+      <w:proofErr w:type="spellEnd"/>
       <w:r>
         <w:t xml:space="preserve"> </w:t>
       </w:r>
@@ -953,12 +874,10 @@
         <w:t xml:space="preserve">    </w:t>
       </w:r>
       <w:proofErr w:type="spellStart"/>
-      <w:proofErr w:type="gramStart"/>
-      <w:r>
-        <w:t>shields</w:t>
-      </w:r>
-      <w:proofErr w:type="spellEnd"/>
-      <w:proofErr w:type="gramEnd"/>
+      <w:r>
+        <w:t>total_hp</w:t>
+      </w:r>
+      <w:proofErr w:type="spellEnd"/>
       <w:r>
         <w:t xml:space="preserve"> </w:t>
       </w:r>
@@ -978,13 +897,21 @@
       <w:r>
         <w:t xml:space="preserve">    </w:t>
       </w:r>
-      <w:proofErr w:type="gramStart"/>
-      <w:r>
-        <w:t>story</w:t>
-      </w:r>
-      <w:proofErr w:type="gramEnd"/>
-      <w:r>
-        <w:t xml:space="preserve"> </w:t>
+      <w:proofErr w:type="spellStart"/>
+      <w:r>
+        <w:t>abilities</w:t>
+      </w:r>
+      <w:proofErr w:type="spellEnd"/>
+      <w:r>
+        <w:t xml:space="preserve"> </w:t>
+      </w:r>
+      <w:proofErr w:type="spellStart"/>
+      <w:r>
+        <w:t>list</w:t>
+      </w:r>
+      <w:proofErr w:type="spellEnd"/>
+      <w:r>
+        <w:t>&lt;</w:t>
       </w:r>
       <w:proofErr w:type="spellStart"/>
       <w:r>
@@ -992,7 +919,7 @@
       </w:r>
       <w:proofErr w:type="spellEnd"/>
       <w:r>
-        <w:t>,</w:t>
+        <w:t>&gt;,</w:t>
       </w:r>
     </w:p>
     <w:p>
@@ -1000,17 +927,15 @@
         <w:spacing w:line="240" w:lineRule="auto"/>
       </w:pPr>
       <w:r>
-        <w:t xml:space="preserve">    </w:t>
-      </w:r>
-      <w:proofErr w:type="spellStart"/>
-      <w:proofErr w:type="gramStart"/>
-      <w:r>
-        <w:t>subrole</w:t>
-      </w:r>
-      <w:proofErr w:type="spellEnd"/>
-      <w:proofErr w:type="gramEnd"/>
-      <w:r>
-        <w:t xml:space="preserve"> </w:t>
+        <w:t xml:space="preserve">    backgrounds </w:t>
+      </w:r>
+      <w:proofErr w:type="spellStart"/>
+      <w:r>
+        <w:t>list</w:t>
+      </w:r>
+      <w:proofErr w:type="spellEnd"/>
+      <w:r>
+        <w:t>&lt;</w:t>
       </w:r>
       <w:proofErr w:type="spellStart"/>
       <w:r>
@@ -1018,7 +943,7 @@
       </w:r>
       <w:proofErr w:type="spellEnd"/>
       <w:r>
-        <w:t>,</w:t>
+        <w:t>&gt;</w:t>
       </w:r>
     </w:p>
     <w:p>
@@ -1026,28 +951,15 @@
         <w:spacing w:line="240" w:lineRule="auto"/>
       </w:pPr>
       <w:r>
-        <w:t xml:space="preserve">    </w:t>
-      </w:r>
-      <w:proofErr w:type="spellStart"/>
-      <w:proofErr w:type="gramStart"/>
-      <w:r>
-        <w:t>total</w:t>
-      </w:r>
-      <w:proofErr w:type="gramEnd"/>
-      <w:r>
-        <w:t>_hp</w:t>
-      </w:r>
-      <w:proofErr w:type="spellEnd"/>
-      <w:r>
-        <w:t xml:space="preserve"> </w:t>
-      </w:r>
-      <w:proofErr w:type="spellStart"/>
-      <w:r>
-        <w:t>int</w:t>
-      </w:r>
-      <w:proofErr w:type="spellEnd"/>
-      <w:r>
-        <w:t>,</w:t>
+        <w:t xml:space="preserve">) WITH </w:t>
+      </w:r>
+      <w:proofErr w:type="spellStart"/>
+      <w:r>
+        <w:t>additional_write_policy</w:t>
+      </w:r>
+      <w:proofErr w:type="spellEnd"/>
+      <w:r>
+        <w:t xml:space="preserve"> = '99p'</w:t>
       </w:r>
     </w:p>
     <w:p>
@@ -1055,33 +967,15 @@
         <w:spacing w:line="240" w:lineRule="auto"/>
       </w:pPr>
       <w:r>
-        <w:t xml:space="preserve">    </w:t>
-      </w:r>
-      <w:proofErr w:type="spellStart"/>
-      <w:proofErr w:type="gramStart"/>
-      <w:r>
-        <w:t>abilities</w:t>
-      </w:r>
-      <w:proofErr w:type="spellEnd"/>
-      <w:proofErr w:type="gramEnd"/>
-      <w:r>
-        <w:t xml:space="preserve"> </w:t>
-      </w:r>
-      <w:proofErr w:type="spellStart"/>
-      <w:r>
-        <w:t>list</w:t>
-      </w:r>
-      <w:proofErr w:type="spellEnd"/>
-      <w:r>
-        <w:t>&lt;</w:t>
-      </w:r>
-      <w:proofErr w:type="spellStart"/>
-      <w:r>
-        <w:t>text</w:t>
-      </w:r>
-      <w:proofErr w:type="spellEnd"/>
-      <w:r>
-        <w:t>&gt;,</w:t>
+        <w:t xml:space="preserve">    AND </w:t>
+      </w:r>
+      <w:proofErr w:type="spellStart"/>
+      <w:r>
+        <w:t>bloom_filter_fp_chance</w:t>
+      </w:r>
+      <w:proofErr w:type="spellEnd"/>
+      <w:r>
+        <w:t xml:space="preserve"> = 0.01</w:t>
       </w:r>
     </w:p>
     <w:p>
@@ -1089,31 +983,23 @@
         <w:spacing w:line="240" w:lineRule="auto"/>
       </w:pPr>
       <w:r>
-        <w:t xml:space="preserve">    </w:t>
-      </w:r>
-      <w:proofErr w:type="gramStart"/>
-      <w:r>
-        <w:t>backgrounds</w:t>
-      </w:r>
-      <w:proofErr w:type="gramEnd"/>
-      <w:r>
-        <w:t xml:space="preserve"> </w:t>
-      </w:r>
-      <w:proofErr w:type="spellStart"/>
-      <w:r>
-        <w:t>list</w:t>
-      </w:r>
-      <w:proofErr w:type="spellEnd"/>
-      <w:r>
-        <w:t>&lt;</w:t>
-      </w:r>
-      <w:proofErr w:type="spellStart"/>
-      <w:r>
-        <w:t>text</w:t>
-      </w:r>
-      <w:proofErr w:type="spellEnd"/>
-      <w:r>
-        <w:t>&gt;</w:t>
+        <w:t xml:space="preserve">    AND </w:t>
+      </w:r>
+      <w:proofErr w:type="spellStart"/>
+      <w:r>
+        <w:t>caching</w:t>
+      </w:r>
+      <w:proofErr w:type="spellEnd"/>
+      <w:r>
+        <w:t xml:space="preserve"> = {'keys': 'ALL', '</w:t>
+      </w:r>
+      <w:proofErr w:type="spellStart"/>
+      <w:r>
+        <w:t>rows_per_partition</w:t>
+      </w:r>
+      <w:proofErr w:type="spellEnd"/>
+      <w:r>
+        <w:t>': 'NONE'}</w:t>
       </w:r>
     </w:p>
     <w:p>
@@ -1121,15 +1007,15 @@
         <w:spacing w:line="240" w:lineRule="auto"/>
       </w:pPr>
       <w:r>
-        <w:t xml:space="preserve">) WITH </w:t>
-      </w:r>
-      <w:proofErr w:type="spellStart"/>
-      <w:r>
-        <w:t>additional_write_policy</w:t>
-      </w:r>
-      <w:proofErr w:type="spellEnd"/>
-      <w:r>
-        <w:t xml:space="preserve"> = '99p'</w:t>
+        <w:t xml:space="preserve">    AND </w:t>
+      </w:r>
+      <w:proofErr w:type="spellStart"/>
+      <w:r>
+        <w:t>cdc</w:t>
+      </w:r>
+      <w:proofErr w:type="spellEnd"/>
+      <w:r>
+        <w:t xml:space="preserve"> = false</w:t>
       </w:r>
     </w:p>
     <w:p>
@@ -1137,15 +1023,7 @@
         <w:spacing w:line="240" w:lineRule="auto"/>
       </w:pPr>
       <w:r>
-        <w:t xml:space="preserve">    AND </w:t>
-      </w:r>
-      <w:proofErr w:type="spellStart"/>
-      <w:r>
-        <w:t>bloom_filter_fp_chance</w:t>
-      </w:r>
-      <w:proofErr w:type="spellEnd"/>
-      <w:r>
-        <w:t xml:space="preserve"> = 0.01</w:t>
+        <w:t xml:space="preserve">    AND comment = ''</w:t>
       </w:r>
     </w:p>
     <w:p>
@@ -1153,36 +1031,23 @@
         <w:spacing w:line="240" w:lineRule="auto"/>
       </w:pPr>
       <w:r>
-        <w:t xml:space="preserve">    AND </w:t>
-      </w:r>
-      <w:proofErr w:type="spellStart"/>
-      <w:r>
-        <w:t>caching</w:t>
-      </w:r>
-      <w:proofErr w:type="spellEnd"/>
-      <w:r>
-        <w:t xml:space="preserve"> = {'keys</w:t>
-      </w:r>
-      <w:proofErr w:type="gramStart"/>
-      <w:r>
-        <w:t>':</w:t>
-      </w:r>
-      <w:proofErr w:type="gramEnd"/>
-      <w:r>
-        <w:t xml:space="preserve"> 'ALL', '</w:t>
-      </w:r>
-      <w:proofErr w:type="spellStart"/>
-      <w:r>
-        <w:t>rows_per_partition</w:t>
-      </w:r>
-      <w:proofErr w:type="spellEnd"/>
-      <w:proofErr w:type="gramStart"/>
-      <w:r>
-        <w:t>':</w:t>
-      </w:r>
-      <w:proofErr w:type="gramEnd"/>
-      <w:r>
-        <w:t xml:space="preserve"> 'NONE'}</w:t>
+        <w:t xml:space="preserve">    AND compaction = {'class': 'org.apache.cassandra.db.compaction.SizeTieredCompactionStrategy', '</w:t>
+      </w:r>
+      <w:proofErr w:type="spellStart"/>
+      <w:r>
+        <w:t>max_threshold</w:t>
+      </w:r>
+      <w:proofErr w:type="spellEnd"/>
+      <w:r>
+        <w:t>': '32', '</w:t>
+      </w:r>
+      <w:proofErr w:type="spellStart"/>
+      <w:r>
+        <w:t>min_threshold</w:t>
+      </w:r>
+      <w:proofErr w:type="spellEnd"/>
+      <w:r>
+        <w:t>': '4'}</w:t>
       </w:r>
     </w:p>
     <w:p>
@@ -1190,88 +1055,6 @@
         <w:spacing w:line="240" w:lineRule="auto"/>
       </w:pPr>
       <w:r>
-        <w:t xml:space="preserve">    AND </w:t>
-      </w:r>
-      <w:proofErr w:type="spellStart"/>
-      <w:r>
-        <w:t>cdc</w:t>
-      </w:r>
-      <w:proofErr w:type="spellEnd"/>
-      <w:r>
-        <w:t xml:space="preserve"> = false</w:t>
-      </w:r>
-    </w:p>
-    <w:p>
-      <w:pPr>
-        <w:spacing w:line="240" w:lineRule="auto"/>
-      </w:pPr>
-      <w:r>
-        <w:t xml:space="preserve">    AND comment = ''</w:t>
-      </w:r>
-    </w:p>
-    <w:p>
-      <w:pPr>
-        <w:spacing w:line="240" w:lineRule="auto"/>
-      </w:pPr>
-      <w:r>
-        <w:t xml:space="preserve">    AND compaction = {'class</w:t>
-      </w:r>
-      <w:proofErr w:type="gramStart"/>
-      <w:r>
-        <w:t>':</w:t>
-      </w:r>
-      <w:proofErr w:type="gramEnd"/>
-      <w:r>
-        <w:t xml:space="preserve"> '</w:t>
-      </w:r>
-      <w:proofErr w:type="gramStart"/>
-      <w:r>
-        <w:t>org.apache</w:t>
-      </w:r>
-      <w:proofErr w:type="gramEnd"/>
-      <w:r>
-        <w:t>.cassandra.</w:t>
-      </w:r>
-      <w:proofErr w:type="gramStart"/>
-      <w:r>
-        <w:t>db.compaction</w:t>
-      </w:r>
-      <w:proofErr w:type="gramEnd"/>
-      <w:r>
-        <w:t>.SizeTieredCompactionStrategy', '</w:t>
-      </w:r>
-      <w:proofErr w:type="spellStart"/>
-      <w:r>
-        <w:t>max_threshold</w:t>
-      </w:r>
-      <w:proofErr w:type="spellEnd"/>
-      <w:proofErr w:type="gramStart"/>
-      <w:r>
-        <w:t>':</w:t>
-      </w:r>
-      <w:proofErr w:type="gramEnd"/>
-      <w:r>
-        <w:t xml:space="preserve"> '32', '</w:t>
-      </w:r>
-      <w:proofErr w:type="spellStart"/>
-      <w:r>
-        <w:t>min_threshold</w:t>
-      </w:r>
-      <w:proofErr w:type="spellEnd"/>
-      <w:proofErr w:type="gramStart"/>
-      <w:r>
-        <w:t>':</w:t>
-      </w:r>
-      <w:proofErr w:type="gramEnd"/>
-      <w:r>
-        <w:t xml:space="preserve"> '4'}</w:t>
-      </w:r>
-    </w:p>
-    <w:p>
-      <w:pPr>
-        <w:spacing w:line="240" w:lineRule="auto"/>
-      </w:pPr>
-      <w:r>
         <w:t xml:space="preserve">    AND compression = {'</w:t>
       </w:r>
       <w:proofErr w:type="spellStart"/>
@@ -1279,29 +1062,8 @@
         <w:t>chunk_length_in_kb</w:t>
       </w:r>
       <w:proofErr w:type="spellEnd"/>
-      <w:proofErr w:type="gramStart"/>
-      <w:r>
-        <w:t>':</w:t>
-      </w:r>
-      <w:proofErr w:type="gramEnd"/>
-      <w:r>
-        <w:t xml:space="preserve"> '16', 'class</w:t>
-      </w:r>
-      <w:proofErr w:type="gramStart"/>
-      <w:r>
-        <w:t>':</w:t>
-      </w:r>
-      <w:proofErr w:type="gramEnd"/>
-      <w:r>
-        <w:t xml:space="preserve"> '</w:t>
-      </w:r>
-      <w:proofErr w:type="gramStart"/>
-      <w:r>
-        <w:t>org.apache.cassandra.io.compress</w:t>
-      </w:r>
-      <w:proofErr w:type="gramEnd"/>
-      <w:r>
-        <w:t>.LZ4Compressor'}</w:t>
+      <w:r>
+        <w:t>': '16', 'class': 'org.apache.cassandra.io.compress.LZ4Compressor'}</w:t>
       </w:r>
     </w:p>
     <w:p>
@@ -1454,13 +1216,8 @@
       </w:r>
       <w:proofErr w:type="spellEnd"/>
       <w:r>
-        <w:t xml:space="preserve"> = '99p</w:t>
-      </w:r>
-      <w:proofErr w:type="gramStart"/>
-      <w:r>
-        <w:t>';</w:t>
-      </w:r>
-      <w:proofErr w:type="gramEnd"/>
+        <w:t xml:space="preserve"> = '99p';</w:t>
+      </w:r>
     </w:p>
     <w:p>
       <w:r>
@@ -1471,12 +1228,10 @@
         <w:t xml:space="preserve">- Générer et exécuter un script d’ingestion pour peupler </w:t>
       </w:r>
       <w:proofErr w:type="spellStart"/>
-      <w:proofErr w:type="gramStart"/>
       <w:r>
         <w:t>overwatch.heroes</w:t>
       </w:r>
       <w:proofErr w:type="spellEnd"/>
-      <w:proofErr w:type="gramEnd"/>
       <w:r>
         <w:t xml:space="preserve"> depuis l’API </w:t>
       </w:r>
@@ -1491,13 +1246,8 @@
     </w:p>
     <w:p>
       <w:r>
-        <w:t xml:space="preserve">  - Je peux créer un script script/get_overwatch.py </w:t>
-      </w:r>
-      <w:proofErr w:type="gramStart"/>
-      <w:r>
-        <w:t>qui:</w:t>
-      </w:r>
-      <w:proofErr w:type="gramEnd"/>
+        <w:t xml:space="preserve">  - Je peux créer un script script/get_overwatch.py qui:</w:t>
+      </w:r>
     </w:p>
     <w:p>
       <w:r>
@@ -1586,12 +1336,10 @@
         <w:t xml:space="preserve">    - insère dans </w:t>
       </w:r>
       <w:proofErr w:type="spellStart"/>
-      <w:proofErr w:type="gramStart"/>
       <w:r>
         <w:t>overwatch.heroes</w:t>
       </w:r>
       <w:proofErr w:type="spellEnd"/>
-      <w:proofErr w:type="gramEnd"/>
       <w:r>
         <w:t>,</w:t>
       </w:r>
@@ -1604,13 +1352,8 @@
     <w:p/>
     <w:p>
       <w:r>
-        <w:t xml:space="preserve">- Vérifier </w:t>
-      </w:r>
-      <w:proofErr w:type="gramStart"/>
-      <w:r>
-        <w:t>ensuite:</w:t>
-      </w:r>
-      <w:proofErr w:type="gramEnd"/>
+        <w:t>- Vérifier ensuite:</w:t>
+      </w:r>
     </w:p>
     <w:p>
       <w:r>
@@ -1673,22 +1416,12 @@
         <w:t xml:space="preserve"> FROM </w:t>
       </w:r>
       <w:proofErr w:type="spellStart"/>
-      <w:proofErr w:type="gramStart"/>
       <w:r>
         <w:t>overwatch.heroes</w:t>
       </w:r>
       <w:proofErr w:type="spellEnd"/>
-      <w:proofErr w:type="gramEnd"/>
-      <w:r>
-        <w:t xml:space="preserve"> LIMIT </w:t>
-      </w:r>
-      <w:proofErr w:type="gramStart"/>
-      <w:r>
-        <w:t>10;</w:t>
-      </w:r>
-      <w:proofErr w:type="gramEnd"/>
-      <w:r>
-        <w:t>"</w:t>
+      <w:r>
+        <w:t xml:space="preserve"> LIMIT 10;"</w:t>
       </w:r>
     </w:p>
     <w:p>
@@ -1725,23 +1458,13 @@
       </w:r>
       <w:proofErr w:type="spellEnd"/>
       <w:r>
-        <w:t xml:space="preserve"> -e "SELECT </w:t>
-      </w:r>
-      <w:proofErr w:type="gramStart"/>
-      <w:r>
-        <w:t>COUNT(</w:t>
-      </w:r>
-      <w:proofErr w:type="gramEnd"/>
-      <w:r>
-        <w:t xml:space="preserve">*) FROM </w:t>
-      </w:r>
-      <w:proofErr w:type="spellStart"/>
-      <w:proofErr w:type="gramStart"/>
+        <w:t xml:space="preserve"> -e "SELECT COUNT(*) FROM </w:t>
+      </w:r>
+      <w:proofErr w:type="spellStart"/>
       <w:r>
         <w:t>overwatch.heroes</w:t>
       </w:r>
       <w:proofErr w:type="spellEnd"/>
-      <w:proofErr w:type="gramEnd"/>
       <w:r>
         <w:t>;"</w:t>
       </w:r>
@@ -1753,13 +1476,11 @@
     </w:p>
     <w:p>
       <w:proofErr w:type="spellStart"/>
-      <w:proofErr w:type="gramStart"/>
       <w:r>
         <w:lastRenderedPageBreak/>
         <w:t>cqlsh:overwatch</w:t>
       </w:r>
       <w:proofErr w:type="spellEnd"/>
-      <w:proofErr w:type="gramEnd"/>
       <w:r>
         <w:t xml:space="preserve">&gt; SELECT </w:t>
       </w:r>
@@ -1780,12 +1501,10 @@
         <w:t xml:space="preserve"> FROM </w:t>
       </w:r>
       <w:proofErr w:type="spellStart"/>
-      <w:proofErr w:type="gramStart"/>
       <w:r>
         <w:t>overwatch.heroes</w:t>
       </w:r>
       <w:proofErr w:type="spellEnd"/>
-      <w:proofErr w:type="gramEnd"/>
       <w:r>
         <w:t xml:space="preserve"> </w:t>
       </w:r>
@@ -1908,12 +1627,10 @@
         <w:t xml:space="preserve">UPDATE </w:t>
       </w:r>
       <w:proofErr w:type="spellStart"/>
-      <w:proofErr w:type="gramStart"/>
       <w:r>
         <w:t>overwatch.heroes</w:t>
       </w:r>
       <w:proofErr w:type="spellEnd"/>
-      <w:proofErr w:type="gramEnd"/>
     </w:p>
     <w:p>
       <w:r>
@@ -1933,12 +1650,10 @@
         <w:t xml:space="preserve">    </w:t>
       </w:r>
       <w:proofErr w:type="spellStart"/>
-      <w:proofErr w:type="gramStart"/>
       <w:r>
         <w:t>armor</w:t>
       </w:r>
       <w:proofErr w:type="spellEnd"/>
-      <w:proofErr w:type="gramEnd"/>
       <w:r>
         <w:t xml:space="preserve"> = 0,</w:t>
       </w:r>
@@ -1948,12 +1663,10 @@
         <w:t xml:space="preserve">    </w:t>
       </w:r>
       <w:proofErr w:type="spellStart"/>
-      <w:proofErr w:type="gramStart"/>
       <w:r>
         <w:t>shields</w:t>
       </w:r>
       <w:proofErr w:type="spellEnd"/>
-      <w:proofErr w:type="gramEnd"/>
       <w:r>
         <w:t xml:space="preserve"> = 0,</w:t>
       </w:r>
@@ -1963,13 +1676,8 @@
         <w:t xml:space="preserve">    </w:t>
       </w:r>
       <w:proofErr w:type="spellStart"/>
-      <w:proofErr w:type="gramStart"/>
-      <w:r>
-        <w:t>total</w:t>
-      </w:r>
-      <w:proofErr w:type="gramEnd"/>
-      <w:r>
-        <w:t>_hp</w:t>
+      <w:r>
+        <w:t>total_hp</w:t>
       </w:r>
       <w:proofErr w:type="spellEnd"/>
       <w:r>
@@ -1993,11 +1701,9 @@
         <w:t>winston</w:t>
       </w:r>
       <w:proofErr w:type="spellEnd"/>
-      <w:proofErr w:type="gramStart"/>
       <w:r>
         <w:t>';</w:t>
       </w:r>
-      <w:proofErr w:type="gramEnd"/>
     </w:p>
     <w:p>
       <w:pPr>
@@ -2063,12 +1769,10 @@
         <w:t xml:space="preserve">DELETE FROM </w:t>
       </w:r>
       <w:proofErr w:type="spellStart"/>
-      <w:proofErr w:type="gramStart"/>
       <w:r>
         <w:t>overwatch.heroes</w:t>
       </w:r>
       <w:proofErr w:type="spellEnd"/>
-      <w:proofErr w:type="gramEnd"/>
       <w:r>
         <w:t xml:space="preserve"> WHERE </w:t>
       </w:r>
@@ -2085,11 +1789,9 @@
         <w:t>winston</w:t>
       </w:r>
       <w:proofErr w:type="spellEnd"/>
-      <w:proofErr w:type="gramStart"/>
       <w:r>
         <w:t>';</w:t>
       </w:r>
-      <w:proofErr w:type="gramEnd"/>
     </w:p>
     <w:p>
       <w:pPr>
@@ -2152,12 +1854,10 @@
         <w:t xml:space="preserve">INSERT INTO </w:t>
       </w:r>
       <w:proofErr w:type="spellStart"/>
-      <w:proofErr w:type="gramStart"/>
       <w:r>
         <w:t>overwatch.heroes</w:t>
       </w:r>
       <w:proofErr w:type="spellEnd"/>
-      <w:proofErr w:type="gramEnd"/>
       <w:r>
         <w:t xml:space="preserve"> (</w:t>
       </w:r>
@@ -2167,13 +1867,8 @@
         <w:t xml:space="preserve">  </w:t>
       </w:r>
       <w:proofErr w:type="spellStart"/>
-      <w:proofErr w:type="gramStart"/>
-      <w:r>
-        <w:t>hero</w:t>
-      </w:r>
-      <w:proofErr w:type="gramEnd"/>
-      <w:r>
-        <w:t>_key</w:t>
+      <w:r>
+        <w:t>hero_key</w:t>
       </w:r>
       <w:proofErr w:type="spellEnd"/>
       <w:r>
@@ -2225,12 +1920,10 @@
         <w:t xml:space="preserve">  </w:t>
       </w:r>
       <w:proofErr w:type="spellStart"/>
-      <w:proofErr w:type="gramStart"/>
       <w:r>
         <w:t>health</w:t>
       </w:r>
       <w:proofErr w:type="spellEnd"/>
-      <w:proofErr w:type="gramEnd"/>
       <w:r>
         <w:t xml:space="preserve">, </w:t>
       </w:r>
@@ -2416,17 +2109,12 @@
         <w:t xml:space="preserve">), </w:t>
       </w:r>
       <w:proofErr w:type="spellStart"/>
-      <w:proofErr w:type="gramStart"/>
       <w:r>
         <w:t>Watchpoint</w:t>
       </w:r>
       <w:proofErr w:type="spellEnd"/>
       <w:r>
-        <w:t>:</w:t>
-      </w:r>
-      <w:proofErr w:type="gramEnd"/>
-      <w:r>
-        <w:t xml:space="preserve"> Gibraltar',</w:t>
+        <w:t>: Gibraltar',</w:t>
       </w:r>
     </w:p>
     <w:p>
@@ -2461,15 +2149,7 @@
     </w:p>
     <w:p>
       <w:r>
-        <w:t xml:space="preserve">  </w:t>
-      </w:r>
-      <w:proofErr w:type="gramStart"/>
-      <w:r>
-        <w:t>[ '</w:t>
-      </w:r>
-      <w:proofErr w:type="gramEnd"/>
-      <w:r>
-        <w:t xml:space="preserve">Tesla Cannon', 'Jump Pack', 'Barrier </w:t>
+        <w:t xml:space="preserve">  [ 'Tesla Cannon', 'Jump Pack', 'Barrier </w:t>
       </w:r>
       <w:proofErr w:type="spellStart"/>
       <w:r>
@@ -2477,15 +2157,7 @@
       </w:r>
       <w:proofErr w:type="spellEnd"/>
       <w:r>
-        <w:t>', 'Primal Rage</w:t>
-      </w:r>
-      <w:proofErr w:type="gramStart"/>
-      <w:r>
-        <w:t>' ]</w:t>
-      </w:r>
-      <w:proofErr w:type="gramEnd"/>
-      <w:r>
-        <w:t>,</w:t>
+        <w:t>', 'Primal Rage' ],</w:t>
       </w:r>
     </w:p>
     <w:p>
@@ -2519,12 +2191,10 @@
         <w:t xml:space="preserve">  </w:t>
       </w:r>
       <w:proofErr w:type="spellStart"/>
-      <w:proofErr w:type="gramStart"/>
       <w:r>
         <w:t>null</w:t>
       </w:r>
       <w:proofErr w:type="spellEnd"/>
-      <w:proofErr w:type="gramEnd"/>
       <w:r>
         <w:t>,</w:t>
       </w:r>
@@ -2534,12 +2204,10 @@
         <w:t xml:space="preserve">  </w:t>
       </w:r>
       <w:proofErr w:type="spellStart"/>
-      <w:proofErr w:type="gramStart"/>
       <w:r>
         <w:t>null</w:t>
       </w:r>
       <w:proofErr w:type="spellEnd"/>
-      <w:proofErr w:type="gramEnd"/>
       <w:r>
         <w:t>,</w:t>
       </w:r>
@@ -2549,27 +2217,20 @@
         <w:t xml:space="preserve">  </w:t>
       </w:r>
       <w:proofErr w:type="spellStart"/>
-      <w:proofErr w:type="gramStart"/>
       <w:r>
         <w:t>toTimestamp</w:t>
       </w:r>
       <w:proofErr w:type="spellEnd"/>
-      <w:proofErr w:type="gramEnd"/>
       <w:r>
         <w:t>(</w:t>
       </w:r>
       <w:proofErr w:type="spellStart"/>
-      <w:proofErr w:type="gramStart"/>
       <w:r>
         <w:t>now</w:t>
       </w:r>
       <w:proofErr w:type="spellEnd"/>
       <w:r>
-        <w:t>(</w:t>
-      </w:r>
-      <w:proofErr w:type="gramEnd"/>
-      <w:r>
-        <w:t>))</w:t>
+        <w:t>())</w:t>
       </w:r>
     </w:p>
     <w:p>
@@ -2895,14 +2556,12 @@
       <w:r>
         <w:t>03_reinsert_winston_defaults.sql</w:t>
       </w:r>
-      <w:proofErr w:type="gramStart"/>
       <w:r>
         <w:t>’</w:t>
       </w:r>
       <w:r>
         <w:t>;</w:t>
       </w:r>
-      <w:proofErr w:type="gramEnd"/>
       <w:r>
         <w:t xml:space="preserve"> ) -&gt; ne fonctionne pas car dossier non créé/reconnu dans docker mais fuck</w:t>
       </w:r>
@@ -2959,12 +2618,10 @@
         <w:t xml:space="preserve">FROM </w:t>
       </w:r>
       <w:proofErr w:type="spellStart"/>
-      <w:proofErr w:type="gramStart"/>
       <w:r>
         <w:t>overwatch.heroes</w:t>
       </w:r>
       <w:proofErr w:type="spellEnd"/>
-      <w:proofErr w:type="gramEnd"/>
       <w:r>
         <w:t xml:space="preserve"> </w:t>
       </w:r>
@@ -3035,6 +2692,127 @@
         </w:drawing>
       </w:r>
     </w:p>
+    <w:p>
+      <w:r>
+        <w:br w:type="page"/>
+      </w:r>
+    </w:p>
+    <w:p>
+      <w:r>
+        <w:lastRenderedPageBreak/>
+        <w:t>Les requêtes à créer : exemple :</w:t>
+      </w:r>
+    </w:p>
+    <w:p>
+      <w:r>
+        <w:t xml:space="preserve">CREATE TABLE </w:t>
+      </w:r>
+      <w:proofErr w:type="spellStart"/>
+      <w:r>
+        <w:t>orders</w:t>
+      </w:r>
+      <w:proofErr w:type="spellEnd"/>
+      <w:r>
+        <w:t xml:space="preserve"> (</w:t>
+      </w:r>
+    </w:p>
+    <w:p>
+      <w:proofErr w:type="spellStart"/>
+      <w:r>
+        <w:t>customer_id</w:t>
+      </w:r>
+      <w:proofErr w:type="spellEnd"/>
+      <w:r>
+        <w:t xml:space="preserve"> </w:t>
+      </w:r>
+      <w:proofErr w:type="spellStart"/>
+      <w:r>
+        <w:t>text</w:t>
+      </w:r>
+      <w:proofErr w:type="spellEnd"/>
+      <w:r>
+        <w:t>,</w:t>
+      </w:r>
+    </w:p>
+    <w:p>
+      <w:proofErr w:type="spellStart"/>
+      <w:r>
+        <w:t>order_data</w:t>
+      </w:r>
+      <w:proofErr w:type="spellEnd"/>
+      <w:r>
+        <w:t xml:space="preserve"> timestamp,</w:t>
+      </w:r>
+    </w:p>
+    <w:p>
+      <w:proofErr w:type="spellStart"/>
+      <w:r>
+        <w:t>product</w:t>
+      </w:r>
+      <w:proofErr w:type="spellEnd"/>
+      <w:r>
+        <w:t xml:space="preserve"> </w:t>
+      </w:r>
+      <w:proofErr w:type="spellStart"/>
+      <w:r>
+        <w:t>text</w:t>
+      </w:r>
+      <w:proofErr w:type="spellEnd"/>
+      <w:r>
+        <w:t>,</w:t>
+      </w:r>
+    </w:p>
+    <w:p>
+      <w:proofErr w:type="spellStart"/>
+      <w:r>
+        <w:t>amount</w:t>
+      </w:r>
+      <w:proofErr w:type="spellEnd"/>
+      <w:r>
+        <w:t xml:space="preserve"> </w:t>
+      </w:r>
+      <w:proofErr w:type="spellStart"/>
+      <w:r>
+        <w:t>decimal</w:t>
+      </w:r>
+      <w:proofErr w:type="spellEnd"/>
+      <w:r>
+        <w:t>,</w:t>
+      </w:r>
+    </w:p>
+    <w:p>
+      <w:r>
+        <w:t>PRIMARY KEY ((</w:t>
+      </w:r>
+      <w:proofErr w:type="spellStart"/>
+      <w:r>
+        <w:t>customer_id</w:t>
+      </w:r>
+      <w:proofErr w:type="spellEnd"/>
+      <w:r>
+        <w:t xml:space="preserve">), </w:t>
+      </w:r>
+      <w:proofErr w:type="spellStart"/>
+      <w:r>
+        <w:t>order_date</w:t>
+      </w:r>
+      <w:proofErr w:type="spellEnd"/>
+      <w:r>
+        <w:t>)</w:t>
+      </w:r>
+    </w:p>
+    <w:p>
+      <w:r>
+        <w:t>);</w:t>
+      </w:r>
+    </w:p>
+    <w:p/>
+    <w:p>
+      <w:r>
+        <w:t>Colonnes à garder pour les requêtes :</w:t>
+      </w:r>
+    </w:p>
+    <w:p/>
     <w:p/>
     <w:p/>
     <w:p/>

</xml_diff>